<commit_message>
Report, figures, workbook completion and submission packaging (B-15)
</commit_message>
<xml_diff>
--- a/Docs/Capstone_Project/02_Stage_Workbooks/Stage_4_Sprint_Plan.docx
+++ b/Docs/Capstone_Project/02_Stage_Workbooks/Stage_4_Sprint_Plan.docx
@@ -438,13 +438,8 @@
             </w:tcBorders>
           </w:tcPr>
           <w:p>
-            <w:pPr>
-              <w:spacing w:before="50" w:after="50"/>
-            </w:pPr>
-            <w:r>
-              <w:rPr>
-                <w:sz w:val="17"/>
-              </w:rPr>
+            <w:r/>
+            <w:r>
               <w:t>Week one</w:t>
             </w:r>
           </w:p>
@@ -460,9 +455,10 @@
             </w:tcBorders>
           </w:tcPr>
           <w:p>
-            <w:pPr>
-              <w:spacing w:before="50" w:after="50"/>
-            </w:pPr>
+            <w:r/>
+            <w:r>
+              <w:t>About 30 alongside other commitments</w:t>
+            </w:r>
           </w:p>
         </w:tc>
         <w:tc>
@@ -476,9 +472,10 @@
             </w:tcBorders>
           </w:tcPr>
           <w:p>
-            <w:pPr>
-              <w:spacing w:before="50" w:after="50"/>
-            </w:pPr>
+            <w:r/>
+            <w:r>
+              <w:t>Other commitments</w:t>
+            </w:r>
           </w:p>
         </w:tc>
         <w:tc>
@@ -492,9 +489,10 @@
             </w:tcBorders>
           </w:tcPr>
           <w:p>
-            <w:pPr>
-              <w:spacing w:before="50" w:after="50"/>
-            </w:pPr>
+            <w:r/>
+            <w:r>
+              <w:t>None recorded</w:t>
+            </w:r>
           </w:p>
         </w:tc>
       </w:tr>
@@ -514,13 +512,8 @@
             <w:shd w:val="clear" w:color="auto" w:fill="F4F4F7"/>
           </w:tcPr>
           <w:p>
-            <w:pPr>
-              <w:spacing w:before="50" w:after="50"/>
-            </w:pPr>
-            <w:r>
-              <w:rPr>
-                <w:sz w:val="17"/>
-              </w:rPr>
+            <w:r/>
+            <w:r>
               <w:t>Week two</w:t>
             </w:r>
           </w:p>
@@ -537,9 +530,10 @@
             <w:shd w:val="clear" w:color="auto" w:fill="F4F4F7"/>
           </w:tcPr>
           <w:p>
-            <w:pPr>
-              <w:spacing w:before="50" w:after="50"/>
-            </w:pPr>
+            <w:r/>
+            <w:r>
+              <w:t>About 30; build compressed into 16 to 17 Sept</w:t>
+            </w:r>
           </w:p>
         </w:tc>
         <w:tc>
@@ -554,9 +548,10 @@
             <w:shd w:val="clear" w:color="auto" w:fill="F4F4F7"/>
           </w:tcPr>
           <w:p>
-            <w:pPr>
-              <w:spacing w:before="50" w:after="50"/>
-            </w:pPr>
+            <w:r/>
+            <w:r>
+              <w:t>Other commitments</w:t>
+            </w:r>
           </w:p>
         </w:tc>
         <w:tc>
@@ -571,9 +566,10 @@
             <w:shd w:val="clear" w:color="auto" w:fill="F4F4F7"/>
           </w:tcPr>
           <w:p>
-            <w:pPr>
-              <w:spacing w:before="50" w:after="50"/>
-            </w:pPr>
+            <w:r/>
+            <w:r>
+              <w:t>None recorded</w:t>
+            </w:r>
           </w:p>
         </w:tc>
       </w:tr>
@@ -592,13 +588,8 @@
             </w:tcBorders>
           </w:tcPr>
           <w:p>
-            <w:pPr>
-              <w:spacing w:before="50" w:after="50"/>
-            </w:pPr>
-            <w:r>
-              <w:rPr>
-                <w:sz w:val="17"/>
-              </w:rPr>
+            <w:r/>
+            <w:r>
               <w:t>Week three</w:t>
             </w:r>
           </w:p>
@@ -614,9 +605,10 @@
             </w:tcBorders>
           </w:tcPr>
           <w:p>
-            <w:pPr>
-              <w:spacing w:before="50" w:after="50"/>
-            </w:pPr>
+            <w:r/>
+            <w:r>
+              <w:t>About 12 (19 to 20 Sept only; deadline 20 Sept 23:59)</w:t>
+            </w:r>
           </w:p>
         </w:tc>
         <w:tc>
@@ -630,9 +622,10 @@
             </w:tcBorders>
           </w:tcPr>
           <w:p>
-            <w:pPr>
-              <w:spacing w:before="50" w:after="50"/>
-            </w:pPr>
+            <w:r/>
+            <w:r>
+              <w:t>Other commitments</w:t>
+            </w:r>
           </w:p>
         </w:tc>
         <w:tc>
@@ -646,9 +639,10 @@
             </w:tcBorders>
           </w:tcPr>
           <w:p>
-            <w:pPr>
-              <w:spacing w:before="50" w:after="50"/>
-            </w:pPr>
+            <w:r/>
+            <w:r>
+              <w:t>None recorded</w:t>
+            </w:r>
           </w:p>
         </w:tc>
       </w:tr>
@@ -5828,9 +5822,10 @@
             <w:shd w:val="clear" w:color="auto" w:fill="F4F4F7"/>
           </w:tcPr>
           <w:p>
-            <w:pPr>
-              <w:spacing w:before="50" w:after="50"/>
-            </w:pPr>
+            <w:r/>
+            <w:r>
+              <w:t>16 Sept</w:t>
+            </w:r>
           </w:p>
         </w:tc>
         <w:tc>
@@ -5845,9 +5840,10 @@
             <w:shd w:val="clear" w:color="auto" w:fill="F4F4F7"/>
           </w:tcPr>
           <w:p>
-            <w:pPr>
-              <w:spacing w:before="50" w:after="50"/>
-            </w:pPr>
+            <w:r/>
+            <w:r>
+              <w:t>B-01 environment (11 pins resolved, Python 3.11), B-02 ingest, prompts committed</w:t>
+            </w:r>
           </w:p>
         </w:tc>
         <w:tc>
@@ -5862,9 +5858,10 @@
             <w:shd w:val="clear" w:color="auto" w:fill="F4F4F7"/>
           </w:tcPr>
           <w:p>
-            <w:pPr>
-              <w:spacing w:before="50" w:after="50"/>
-            </w:pPr>
+            <w:r/>
+            <w:r>
+              <w:t>B-03 to B-11: chunking, retrieval, harness, classifier, routing, generation, guardrails, log, full dev run, validation run</w:t>
+            </w:r>
           </w:p>
         </w:tc>
         <w:tc>
@@ -5879,9 +5876,10 @@
             <w:shd w:val="clear" w:color="auto" w:fill="F4F4F7"/>
           </w:tcPr>
           <w:p>
-            <w:pPr>
-              <w:spacing w:before="50" w:after="50"/>
-            </w:pPr>
+            <w:r/>
+            <w:r>
+              <w:t>Pack requirements.txt did not resolve; free model variant capped at 50 requests a day</w:t>
+            </w:r>
           </w:p>
         </w:tc>
       </w:tr>
@@ -5900,9 +5898,10 @@
             </w:tcBorders>
           </w:tcPr>
           <w:p>
-            <w:pPr>
-              <w:spacing w:before="50" w:after="50"/>
-            </w:pPr>
+            <w:r/>
+            <w:r>
+              <w:t>17 Sept</w:t>
+            </w:r>
           </w:p>
         </w:tc>
         <w:tc>
@@ -5916,9 +5915,10 @@
             </w:tcBorders>
           </w:tcPr>
           <w:p>
-            <w:pPr>
-              <w:spacing w:before="50" w:after="50"/>
-            </w:pPr>
+            <w:r/>
+            <w:r>
+              <w:t>B-03 to B-11 done; B-12 monitoring, B-13 CI (first run failed, prompts/build gitignored, fixed), B-14 fairness audit, B-16 API, B-17 governance, B-18 Stage 5 sections 1 to 4</w:t>
+            </w:r>
           </w:p>
         </w:tc>
         <w:tc>
@@ -5932,9 +5932,10 @@
             </w:tcBorders>
           </w:tcPr>
           <w:p>
-            <w:pPr>
-              <w:spacing w:before="50" w:after="50"/>
-            </w:pPr>
+            <w:r/>
+            <w:r>
+              <w:t>B-19 README rewrite and clean-clone rehearsal; Stage 2 sync to v2.0</w:t>
+            </w:r>
           </w:p>
         </w:tc>
         <w:tc>
@@ -5948,9 +5949,10 @@
             </w:tcBorders>
           </w:tcPr>
           <w:p>
-            <w:pPr>
-              <w:spacing w:before="50" w:after="50"/>
-            </w:pPr>
+            <w:r/>
+            <w:r>
+              <w:t>Clean clone: uv venv without pip, Windows path limit, uncommitted samples</w:t>
+            </w:r>
           </w:p>
         </w:tc>
       </w:tr>
@@ -5970,9 +5972,10 @@
             <w:shd w:val="clear" w:color="auto" w:fill="F4F4F7"/>
           </w:tcPr>
           <w:p>
-            <w:pPr>
-              <w:spacing w:before="50" w:after="50"/>
-            </w:pPr>
+            <w:r/>
+            <w:r>
+              <w:t>19 Sept</w:t>
+            </w:r>
           </w:p>
         </w:tc>
         <w:tc>
@@ -5987,9 +5990,10 @@
             <w:shd w:val="clear" w:color="auto" w:fill="F4F4F7"/>
           </w:tcPr>
           <w:p>
-            <w:pPr>
-              <w:spacing w:before="50" w:after="50"/>
-            </w:pPr>
+            <w:r/>
+            <w:r>
+              <w:t>B-19 done; Stage 2 synced</w:t>
+            </w:r>
           </w:p>
         </w:tc>
         <w:tc>
@@ -6004,9 +6008,10 @@
             <w:shd w:val="clear" w:color="auto" w:fill="F4F4F7"/>
           </w:tcPr>
           <w:p>
-            <w:pPr>
-              <w:spacing w:before="50" w:after="50"/>
-            </w:pPr>
+            <w:r/>
+            <w:r>
+              <w:t>B-15: report figures, report draft, PDF, submission folder and packaging script</w:t>
+            </w:r>
           </w:p>
         </w:tc>
         <w:tc>
@@ -6021,9 +6026,10 @@
             <w:shd w:val="clear" w:color="auto" w:fill="F4F4F7"/>
           </w:tcPr>
           <w:p>
-            <w:pPr>
-              <w:spacing w:before="50" w:after="50"/>
-            </w:pPr>
+            <w:r/>
+            <w:r>
+              <w:t>None</w:t>
+            </w:r>
           </w:p>
         </w:tc>
       </w:tr>
@@ -6042,9 +6048,10 @@
             </w:tcBorders>
           </w:tcPr>
           <w:p>
-            <w:pPr>
-              <w:spacing w:before="50" w:after="50"/>
-            </w:pPr>
+            <w:r/>
+            <w:r>
+              <w:t>20 Sept</w:t>
+            </w:r>
           </w:p>
         </w:tc>
         <w:tc>
@@ -6058,9 +6065,10 @@
             </w:tcBorders>
           </w:tcPr>
           <w:p>
-            <w:pPr>
-              <w:spacing w:before="50" w:after="50"/>
-            </w:pPr>
+            <w:r/>
+            <w:r>
+              <w:t>Report built (41 pages), package built, demo rehearsed</w:t>
+            </w:r>
           </w:p>
         </w:tc>
         <w:tc>
@@ -6074,9 +6082,10 @@
             </w:tcBorders>
           </w:tcPr>
           <w:p>
-            <w:pPr>
-              <w:spacing w:before="50" w:after="50"/>
-            </w:pPr>
+            <w:r/>
+            <w:r>
+              <w:t>Author sections, Stage 5 section 5, effort log hours, video, final package and submission</w:t>
+            </w:r>
           </w:p>
         </w:tc>
         <w:tc>
@@ -6090,9 +6099,10 @@
             </w:tcBorders>
           </w:tcPr>
           <w:p>
-            <w:pPr>
-              <w:spacing w:before="50" w:after="50"/>
-            </w:pPr>
+            <w:r/>
+            <w:r>
+              <w:t>Deadline 23:59</w:t>
+            </w:r>
           </w:p>
         </w:tc>
       </w:tr>

</xml_diff>